<commit_message>
Normalize package signature fixture topology
</commit_message>
<xml_diff>
--- a/fixtures/review.package_signature_declared_coverage_changed/baseline.docx
+++ b/fixtures/review.package_signature_declared_coverage_changed/baseline.docx
@@ -51,13 +51,13 @@
   <ds:SignedInfo>
     <ds:CanonicalizationMethod Algorithm="http://www.w3.org/TR/2001/REC-xml-c14n-20010315"/>
     <ds:SignatureMethod Algorithm="http://www.w3.org/2001/04/xmldsig-more#rsa-sha256"/>
-    <ds:Reference Type="http://www.w3.org/2000/09/xmldsig#Object" URI="#dcabPackageObject">
+    <ds:Reference Type="http://www.w3.org/2000/09/xmldsig#Object" URI="#idPackageObject">
       <ds:DigestMethod Algorithm="http://www.w3.org/2001/04/xmlenc#sha256"/>
       <ds:DigestValue>DCAB_NONCRYPTOGRAPHIC_DIGEST_VALUE</ds:DigestValue>
     </ds:Reference>
   </ds:SignedInfo>
   <ds:SignatureValue>DCAB_NONCRYPTOGRAPHIC_SIGNATURE_VALUE</ds:SignatureValue>
-  <ds:Object Id="dcabPackageObject">
+  <ds:Object Id="idPackageObject">
     <ds:Manifest>
       <ds:Reference URI="/_rels/.rels?ContentType=application/vnd.openxmlformats-package.relationships+xml">
         <ds:Transforms>

</xml_diff>